<commit_message>
Remove personal author details from public docs
</commit_message>
<xml_diff>
--- a/BUS278_AI_Daily_Digest_Executive_Proposal.docx
+++ b/BUS278_AI_Daily_Digest_Executive_Proposal.docx
@@ -36,22 +36,6 @@
       </w:r>
       <w:r>
         <w:t xml:space="preserve">AI Daily Digest: A Leadership Briefing System for Staying Current on AI</w:t>
-      </w:r>
-      <w:r>
-        <w:br/>
-      </w:r>
-      <w:r>
-        <w:rPr>
-          <w:b/>
-          <w:bCs/>
-        </w:rPr>
-        <w:t xml:space="preserve">Author:</w:t>
-      </w:r>
-      <w:r>
-        <w:t xml:space="preserve"> </w:t>
-      </w:r>
-      <w:r>
-        <w:t xml:space="preserve">Kashika Manocha</w:t>
       </w:r>
       <w:r>
         <w:br/>

</xml_diff>